<commit_message>
strip em dashes, re-render
</commit_message>
<xml_diff>
--- a/R/final_report.docx
+++ b/R/final_report.docx
@@ -23,7 +23,7 @@
         <w:pStyle w:val="Author"/>
       </w:pPr>
       <w:r>
-        <w:t xml:space="preserve">STATS 101B, Group 29 — Kevin Brady, Jonathan Deng, Sung Heon Kang, Jack Lutz, Kathy Nguyen, Siri Suvvari</w:t>
+        <w:t xml:space="preserve">STATS 101B, Group 29: Kevin Brady, Jonathan Deng, Sung Heon Kang, Jack Lutz, Kathy Nguyen, Siri Suvvari</w:t>
       </w:r>
     </w:p>
     <w:p>
@@ -501,7 +501,7 @@
           <w:b/>
           <w:bCs/>
         </w:rPr>
-        <w:t xml:space="preserve">Treatment factor — alcohol dose:</w:t>
+        <w:t xml:space="preserve">Treatment factor (alcohol dose):</w:t>
       </w:r>
       <w:r>
         <w:t xml:space="preserve"> </w:t>
@@ -535,7 +535,7 @@
           <w:b/>
           <w:bCs/>
         </w:rPr>
-        <w:t xml:space="preserve">Blocking factor — task difficulty:</w:t>
+        <w:t xml:space="preserve">Blocking factor (task difficulty):</w:t>
       </w:r>
       <w:r>
         <w:t xml:space="preserve"> </w:t>
@@ -2585,7 +2585,7 @@
         <w:t xml:space="preserve"> </w:t>
       </w:r>
       <w:r>
-        <w:t xml:space="preserve">hard arithmetic leans on working memory and controlled attention — exactly the</w:t>
+        <w:t xml:space="preserve">hard arithmetic leans on working memory and controlled attention, exactly the</w:t>
       </w:r>
       <w:r>
         <w:t xml:space="preserve"> </w:t>
@@ -2762,7 +2762,7 @@
         <w:t xml:space="preserve"> </w:t>
       </w:r>
       <w:r>
-        <w:t xml:space="preserve">test–retest control arm would be needed to net it out cleanly.</w:t>
+        <w:t xml:space="preserve">test-retest control arm would be needed to net it out cleanly.</w:t>
       </w:r>
     </w:p>
     <w:p>
@@ -2926,7 +2926,7 @@
         <w:pStyle w:val="FirstParagraph"/>
       </w:pPr>
       <w:r>
-        <w:t xml:space="preserve">Natural next steps follow directly: add a sober test–retest control arm to</w:t>
+        <w:t xml:space="preserve">Natural next steps follow directly: add a sober test-retest control arm to</w:t>
       </w:r>
       <w:r>
         <w:t xml:space="preserve"> </w:t>

</xml_diff>